<commit_message>
Add inference costs in the report and rerun the scripts
</commit_message>
<xml_diff>
--- a/3036411009.docx
+++ b/3036411009.docx
@@ -65,19 +65,7 @@
           <w:rPr>
             <w:rStyle w:val="a8"/>
           </w:rPr>
-          <w:t>the HumanEv</w:t>
-        </w:r>
-        <w:r>
-          <w:rPr>
-            <w:rStyle w:val="a8"/>
-          </w:rPr>
-          <w:t>a</w:t>
-        </w:r>
-        <w:r>
-          <w:rPr>
-            <w:rStyle w:val="a8"/>
-          </w:rPr>
-          <w:t>l dataset</w:t>
+          <w:t>the HumanEval dataset</w:t>
         </w:r>
       </w:hyperlink>
       <w:r>
@@ -114,15 +102,7 @@
         <w:t xml:space="preserve"> </w:t>
       </w:r>
       <w:r>
-        <w:t xml:space="preserve">separately and then together to enhance the performance. The influence of hyperparameters (temperature and </w:t>
-      </w:r>
-      <w:proofErr w:type="spellStart"/>
-      <w:r>
-        <w:t>top_p</w:t>
-      </w:r>
-      <w:proofErr w:type="spellEnd"/>
-      <w:r>
-        <w:t>) and evaluation metrics (pass@1, pass@3) are experimented with and recorded to analyze the effects of different methods compared with the baseline. Though the two methods show little improvement independently, the combined implementation achieves an over 10% absolute increase in pass@1 metric in comparison with the baseline.</w:t>
+        <w:t>separately and then together to enhance the performance. The influence of hyperparameters (temperature and top_p) and evaluation metrics (pass@1, pass@3) are experimented with and recorded to analyze the effects of different methods compared with the baseline. Though the two methods show little improvement independently, the combined implementation achieves an over 10% absolute increase in pass@1 metric in comparison with the baseline.</w:t>
       </w:r>
     </w:p>
     <w:p>
@@ -177,21 +157,7 @@
         <w:rPr>
           <w:rFonts w:hint="eastAsia"/>
         </w:rPr>
-        <w:t xml:space="preserve"> and </w:t>
-      </w:r>
-      <w:proofErr w:type="spellStart"/>
-      <w:r>
-        <w:rPr>
-          <w:rFonts w:hint="eastAsia"/>
-        </w:rPr>
-        <w:t>CodeT</w:t>
-      </w:r>
-      <w:proofErr w:type="spellEnd"/>
-      <w:r>
-        <w:rPr>
-          <w:rFonts w:hint="eastAsia"/>
-        </w:rPr>
-        <w:t xml:space="preserve"> </w:t>
+        <w:t xml:space="preserve"> and CodeT </w:t>
       </w:r>
       <w:r>
         <w:fldChar w:fldCharType="begin"/>
@@ -288,19 +254,11 @@
       <w:r>
         <w:t xml:space="preserve">, if k solutions are generated, </w:t>
       </w:r>
-      <w:proofErr w:type="spellStart"/>
-      <w:r>
-        <w:rPr>
-          <w:rFonts w:hint="eastAsia"/>
-        </w:rPr>
-        <w:t>pass@k</w:t>
-      </w:r>
-      <w:proofErr w:type="spellEnd"/>
-      <w:r>
-        <w:rPr>
-          <w:rFonts w:hint="eastAsia"/>
-        </w:rPr>
-        <w:t xml:space="preserve"> is </w:t>
+      <w:r>
+        <w:rPr>
+          <w:rFonts w:hint="eastAsia"/>
+        </w:rPr>
+        <w:t xml:space="preserve">pass@k is </w:t>
       </w:r>
       <w:r>
         <w:t>the possibility that any of the k solutions solves the problem.</w:t>
@@ -311,15 +269,7 @@
         <w:spacing w:after="218"/>
       </w:pPr>
       <w:r>
-        <w:t xml:space="preserve">The evaluation code offers an unbiased method to estimate </w:t>
-      </w:r>
-      <w:proofErr w:type="spellStart"/>
-      <w:r>
-        <w:t>pass@k</w:t>
-      </w:r>
-      <w:proofErr w:type="spellEnd"/>
-      <w:r>
-        <w:t>:</w:t>
+        <w:t>The evaluation code offers an unbiased method to estimate pass@k:</w:t>
       </w:r>
     </w:p>
     <w:p>
@@ -550,15 +500,7 @@
         <w:spacing w:after="218"/>
       </w:pPr>
       <w:r>
-        <w:t xml:space="preserve">Self-Evolve provides a prompt template for reasoning and then solving coding problems. It also conducts experiments to show that a single round of self-refinement can achieve substantial enhancements in accuracy for the </w:t>
-      </w:r>
-      <w:proofErr w:type="spellStart"/>
-      <w:r>
-        <w:t>HumanEval</w:t>
-      </w:r>
-      <w:proofErr w:type="spellEnd"/>
-      <w:r>
-        <w:t xml:space="preserve"> dataset, while additional iterations yield diminishing returns</w:t>
+        <w:t>Self-Evolve provides a prompt template for reasoning and then solving coding problems. It also conducts experiments to show that a single round of self-refinement can achieve substantial enhancements in accuracy for the HumanEval dataset, while additional iterations yield diminishing returns</w:t>
       </w:r>
       <w:r>
         <w:rPr>
@@ -631,21 +573,7 @@
         <w:rPr>
           <w:rFonts w:hint="eastAsia"/>
         </w:rPr>
-        <w:t xml:space="preserve">To better evaluate the performance of solutions, </w:t>
-      </w:r>
-      <w:proofErr w:type="spellStart"/>
-      <w:r>
-        <w:rPr>
-          <w:rFonts w:hint="eastAsia"/>
-        </w:rPr>
-        <w:t>CodeT</w:t>
-      </w:r>
-      <w:proofErr w:type="spellEnd"/>
-      <w:r>
-        <w:rPr>
-          <w:rFonts w:hint="eastAsia"/>
-        </w:rPr>
-        <w:t xml:space="preserve"> </w:t>
+        <w:t xml:space="preserve">To better evaluate the performance of solutions, CodeT </w:t>
       </w:r>
       <w:r>
         <w:fldChar w:fldCharType="begin"/>
@@ -734,21 +662,7 @@
         <w:rPr>
           <w:rFonts w:hint="eastAsia"/>
         </w:rPr>
-        <w:t xml:space="preserve">3.1 </w:t>
-      </w:r>
-      <w:proofErr w:type="spellStart"/>
-      <w:r>
-        <w:rPr>
-          <w:rFonts w:hint="eastAsia"/>
-        </w:rPr>
-        <w:t>Zeroshot</w:t>
-      </w:r>
-      <w:proofErr w:type="spellEnd"/>
-      <w:r>
-        <w:rPr>
-          <w:rFonts w:hint="eastAsia"/>
-        </w:rPr>
-        <w:t xml:space="preserve"> baseline</w:t>
+        <w:t>3.1 Zeroshot baseline</w:t>
       </w:r>
     </w:p>
     <w:p>
@@ -756,23 +670,7 @@
         <w:spacing w:after="218"/>
       </w:pPr>
       <w:r>
-        <w:t xml:space="preserve">This method evaluates the basic performance of llama-3.1-8B-Instruct. The system prompt tells the model to solve the coding problems with Python, and the next user prompt provides the raw question without any additional instruction. Different pairs of temperature and </w:t>
-      </w:r>
-      <w:proofErr w:type="spellStart"/>
-      <w:r>
-        <w:t>top_p</w:t>
-      </w:r>
-      <w:proofErr w:type="spellEnd"/>
-      <w:r>
-        <w:t xml:space="preserve"> are tested to examine their relations with </w:t>
-      </w:r>
-      <w:proofErr w:type="spellStart"/>
-      <w:r>
-        <w:t>pass@k</w:t>
-      </w:r>
-      <w:proofErr w:type="spellEnd"/>
-      <w:r>
-        <w:t>. Given that the estimated metric is more accurate with more samples, this paper chooses n = 5 for calculating pass@1 and pass@3. In addition, the evaluation code is slightly modified.</w:t>
+        <w:t>This method evaluates the basic performance of llama-3.1-8B-Instruct. The system prompt tells the model to solve the coding problems with Python, and the next user prompt provides the raw question without any additional instruction. Different pairs of temperature and top_p are tested to examine their relations with pass@k. Given that the estimated metric is more accurate with more samples, this paper chooses n = 5 for calculating pass@1 and pass@3. In addition, the evaluation code is slightly modified.</w:t>
       </w:r>
     </w:p>
     <w:p>
@@ -793,15 +691,7 @@
         <w:spacing w:after="218"/>
       </w:pPr>
       <w:r>
-        <w:t xml:space="preserve">After experimenting with hyperparameters in the baseline, temperature and </w:t>
-      </w:r>
-      <w:proofErr w:type="spellStart"/>
-      <w:r>
-        <w:t>top_p</w:t>
-      </w:r>
-      <w:proofErr w:type="spellEnd"/>
-      <w:r>
-        <w:t xml:space="preserve"> are set as 0.8 for subsequent methods. For self-evolve, this paper refers to its prompt template and develops a three-step process. First, the program enquires the LLM about how to solve the problem. The LLM is required to output knowledge in natural language only. With the received knowledge, the program asks the model to generate a code solution without any explanation or natural language. The previous chat history (sub_prompt_1 and the 1stresponse) becomes necessary context and thus is concatenated with the 2ndsub_prompt, so the LLM can take the generated knowledge into account.</w:t>
+        <w:t>After experimenting with hyperparameters in the baseline, temperature and top_p are set as 0.8 for subsequent methods. For self-evolve, this paper refers to its prompt template and develops a three-step process. First, the program enquires the LLM about how to solve the problem. The LLM is required to output knowledge in natural language only. With the received knowledge, the program asks the model to generate a code solution without any explanation or natural language. The previous chat history (sub_prompt_1 and the 1stresponse) becomes necessary context and thus is concatenated with the 2ndsub_prompt, so the LLM can take the generated knowledge into account.</w:t>
       </w:r>
     </w:p>
     <w:p>
@@ -809,23 +699,7 @@
         <w:spacing w:after="218"/>
       </w:pPr>
       <w:r>
-        <w:t xml:space="preserve">The solution from the 2nd response is examined with the first test case in each problem to generate test feedback. If the feedback shows the solution passes the test, the 2nd </w:t>
-      </w:r>
-      <w:proofErr w:type="spellStart"/>
-      <w:r>
-        <w:t>sub_prompt</w:t>
-      </w:r>
-      <w:proofErr w:type="spellEnd"/>
-      <w:r>
-        <w:t xml:space="preserve"> and its response (code solution) become the final prompt and output. If not, the program creates another </w:t>
-      </w:r>
-      <w:proofErr w:type="spellStart"/>
-      <w:r>
-        <w:t>sub_prompt</w:t>
-      </w:r>
-      <w:proofErr w:type="spellEnd"/>
-      <w:r>
-        <w:t xml:space="preserve"> with the whole code (the completed function and the test function with the test case) and refinement paddings and asks the LLM one more time for refinement (enough already</w:t>
+        <w:t>The solution from the 2nd response is examined with the first test case in each problem to generate test feedback. If the feedback shows the solution passes the test, the 2nd sub_prompt and its response (code solution) become the final prompt and output. If not, the program creates another sub_prompt with the whole code (the completed function and the test function with the test case) and refinement paddings and asks the LLM one more time for refinement (enough already</w:t>
       </w:r>
       <w:r>
         <w:rPr>
@@ -852,18 +726,7 @@
         <w:fldChar w:fldCharType="end"/>
       </w:r>
       <w:r>
-        <w:t xml:space="preserve"> </w:t>
-      </w:r>
-      <w:r>
-        <w:t xml:space="preserve">). According to the test results (wrong answer or syntax error), different padding texts are added behind the whole code to help the model understand its mistake better. The 3rd </w:t>
-      </w:r>
-      <w:proofErr w:type="spellStart"/>
-      <w:r>
-        <w:t>sub_prompt</w:t>
-      </w:r>
-      <w:proofErr w:type="spellEnd"/>
-      <w:r>
-        <w:t xml:space="preserve"> and its response become the final prompt and output.</w:t>
+        <w:t xml:space="preserve"> ). According to the test results (wrong answer or syntax error), different padding texts are added behind the whole code to help the model understand its mistake better. The 3rd sub_prompt and its response become the final prompt and output.</w:t>
       </w:r>
     </w:p>
     <w:p>
@@ -875,21 +738,7 @@
         <w:rPr>
           <w:rFonts w:hint="eastAsia"/>
         </w:rPr>
-        <w:t xml:space="preserve">3.3 </w:t>
-      </w:r>
-      <w:proofErr w:type="spellStart"/>
-      <w:r>
-        <w:rPr>
-          <w:rFonts w:hint="eastAsia"/>
-        </w:rPr>
-        <w:t>CodeT</w:t>
-      </w:r>
-      <w:proofErr w:type="spellEnd"/>
-      <w:r>
-        <w:rPr>
-          <w:rFonts w:hint="eastAsia"/>
-        </w:rPr>
-        <w:t xml:space="preserve"> method</w:t>
+        <w:t>3.3 CodeT method</w:t>
       </w:r>
     </w:p>
     <w:p>
@@ -897,15 +746,7 @@
         <w:spacing w:after="218"/>
       </w:pPr>
       <w:r>
-        <w:t xml:space="preserve">For this method, the program first concatenates the </w:t>
-      </w:r>
-      <w:proofErr w:type="spellStart"/>
-      <w:r>
-        <w:t>canonical_solution</w:t>
-      </w:r>
-      <w:proofErr w:type="spellEnd"/>
-      <w:r>
-        <w:t xml:space="preserve"> in the dataset with the problem to construct a completion and then adds the test function (check(candidate)) and a line with a single “assert” to remind the LLM to generate more test cases in assertation format. </w:t>
+        <w:t xml:space="preserve">For this method, the program first concatenates the canonical_solution in the dataset with the problem to construct a completion and then adds the test function (check(candidate)) and a line with a single “assert” to remind the LLM to generate more test cases in assertation format. </w:t>
       </w:r>
     </w:p>
     <w:p>
@@ -940,15 +781,25 @@
         <w:fldChar w:fldCharType="end"/>
       </w:r>
       <w:r>
-        <w:t xml:space="preserve">, this project leverages the </w:t>
-      </w:r>
-      <w:proofErr w:type="spellStart"/>
-      <w:r>
-        <w:t>canonical_solution</w:t>
-      </w:r>
-      <w:proofErr w:type="spellEnd"/>
-      <w:r>
-        <w:t xml:space="preserve"> to check the generated tests and clear all toxic cases that the ground truth function cannot pass. Before saving the test set, manual cleaning and size reduction are applied to further its quality. Given no toxic cases exist, the simplified scoring method only needs to count how many cases each solution passes and select solutions with the top k highest pass count as outputs.</w:t>
+        <w:t xml:space="preserve">, this project leverages the canonical_solution to check the generated tests and clear all toxic cases that the ground truth function cannot pass. Before saving the test set, manual cleaning and size reduction are applied to further its quality. </w:t>
+      </w:r>
+      <w:r>
+        <w:rPr>
+          <w:rFonts w:hint="eastAsia"/>
+        </w:rPr>
+        <w:t xml:space="preserve">For some problems which the LLM itself cannot generate more than 5 different correct cases, they are </w:t>
+      </w:r>
+      <w:r>
+        <w:t>manually</w:t>
+      </w:r>
+      <w:r>
+        <w:rPr>
+          <w:rFonts w:hint="eastAsia"/>
+        </w:rPr>
+        <w:t xml:space="preserve"> supplied to 5 cases. </w:t>
+      </w:r>
+      <w:r>
+        <w:t>Given no toxic cases exist, the simplified scoring method only needs to count how many cases each solution passes and select solutions with the top k highest pass count as outputs.</w:t>
       </w:r>
     </w:p>
     <w:p>
@@ -956,7 +807,16 @@
         <w:spacing w:after="218"/>
       </w:pPr>
       <w:r>
-        <w:t>Moreover, inspired by the idea that the finetuned test set only needs to be generated once, and all the solutions can be examined by it, this project can divide the whole process into separate steps and create checkpoints for interim results. Then the program can continue from the latest checkpoint if unexpected errors or time and resource limits interrupt it.</w:t>
+        <w:t xml:space="preserve">Moreover, inspired by the idea that the finetuned test set only needs to be generated once, and all the solutions can be examined by it, this project can divide the whole process into separate steps and create checkpoints for interim results. Then the program can continue from the latest checkpoint if unexpected errors or </w:t>
+      </w:r>
+      <w:r>
+        <w:rPr>
+          <w:rFonts w:hint="eastAsia"/>
+        </w:rPr>
+        <w:t>rate</w:t>
+      </w:r>
+      <w:r>
+        <w:t xml:space="preserve"> limits interrupt it.</w:t>
       </w:r>
     </w:p>
     <w:p>
@@ -985,15 +845,7 @@
         <w:spacing w:after="218"/>
       </w:pPr>
       <w:r>
-        <w:t xml:space="preserve">The final method combines the two above methods, self-evolve provides a more complete generation flow and </w:t>
-      </w:r>
-      <w:proofErr w:type="spellStart"/>
-      <w:r>
-        <w:t>codeT</w:t>
-      </w:r>
-      <w:proofErr w:type="spellEnd"/>
-      <w:r>
-        <w:t xml:space="preserve"> offers a larger and better test set to enhance the examination part of the former method. The combined method first generates solutions using the knowledge-then-code query process and then checks the correctness of each solution with the test set. Top k solutions are selected, and their respective wrong cases (if they exist) are recorded. After the examination, selected solutions need to go through self-refinement if they have wrong test cases. All the wrong cases can be sent together once because each of them is just an assertion line. Finally, solutions passing all tests or being refined become the output of the program.</w:t>
+        <w:t>The final method combines the two above methods, self-evolve provides a more complete generation flow and codeT offers a larger and better test set to enhance the examination part of the former method. The combined method first generates solutions using the knowledge-then-code query process and then checks the correctness of each solution with the test set. Top k solutions are selected, and their respective wrong cases (if they exist) are recorded. After the examination, selected solutions need to go through self-refinement if they have wrong test cases. All the wrong cases can be sent together once because each of them is just an assertion line. Finally, solutions passing all tests or being refined become the output of the program.</w:t>
       </w:r>
     </w:p>
     <w:p>
@@ -1041,23 +893,7 @@
         <w:spacing w:after="218"/>
       </w:pPr>
       <w:r>
-        <w:t xml:space="preserve">In the “completions” module from </w:t>
-      </w:r>
-      <w:proofErr w:type="spellStart"/>
-      <w:r>
-        <w:t>OpenAI.chat</w:t>
-      </w:r>
-      <w:proofErr w:type="spellEnd"/>
-      <w:r>
-        <w:t xml:space="preserve">, temperature and </w:t>
-      </w:r>
-      <w:proofErr w:type="spellStart"/>
-      <w:r>
-        <w:t>top_p</w:t>
-      </w:r>
-      <w:proofErr w:type="spellEnd"/>
-      <w:r>
-        <w:t xml:space="preserve"> are editable hyperparameters controlling the response of LLM.</w:t>
+        <w:t>In the “completions” module from OpenAI.chat, temperature and top_p are editable hyperparameters controlling the response of LLM.</w:t>
       </w:r>
       <w:r>
         <w:rPr>
@@ -1131,19 +967,11 @@
         </w:rPr>
         <w:t xml:space="preserve"> </w:t>
       </w:r>
-      <w:proofErr w:type="spellStart"/>
-      <w:r>
-        <w:rPr>
-          <w:rFonts w:hint="eastAsia"/>
-        </w:rPr>
-        <w:t>Pass@k</w:t>
-      </w:r>
-      <w:proofErr w:type="spellEnd"/>
-      <w:r>
-        <w:rPr>
-          <w:rFonts w:hint="eastAsia"/>
-        </w:rPr>
-        <w:t xml:space="preserve"> derived from models with different temperature (5 total samples)</w:t>
+      <w:r>
+        <w:rPr>
+          <w:rFonts w:hint="eastAsia"/>
+        </w:rPr>
+        <w:t>Pass@k derived from models with different temperature (5 total samples)</w:t>
       </w:r>
       <w:r>
         <w:rPr>
@@ -1161,15 +989,7 @@
       </w:r>
       <w:r>
         <w:lastRenderedPageBreak/>
-        <w:t xml:space="preserve">decreases after a threshold. For different </w:t>
-      </w:r>
-      <w:proofErr w:type="spellStart"/>
-      <w:r>
-        <w:t>pass@k</w:t>
-      </w:r>
-      <w:proofErr w:type="spellEnd"/>
-      <w:r>
-        <w:t xml:space="preserve"> metrics, a smaller k metric is more important because users generally want LLMs to solve problems with fewer attempts. However, a slightly larger k can indicate a more accurate trend because of larger</w:t>
+        <w:t>decreases after a threshold. For different pass@k metrics, a smaller k metric is more important because users generally want LLMs to solve problems with fewer attempts. However, a slightly larger k can indicate a more accurate trend because of larger</w:t>
       </w:r>
       <w:r>
         <w:rPr>
@@ -1228,45 +1048,8 @@
         <w:spacing w:after="218"/>
       </w:pPr>
       <w:r>
-        <w:t xml:space="preserve">Then another hyperparameter, </w:t>
-      </w:r>
-      <w:proofErr w:type="spellStart"/>
-      <w:r>
-        <w:t>top_p</w:t>
-      </w:r>
-      <w:proofErr w:type="spellEnd"/>
-      <w:r>
-        <w:t>, is experimented. It denotes the proportion of options that a LLM considers when responding. The LLM sorts the probabilities of the outputs in descending order and calculates the accumulated probability. Once the value exceeds the threshold (</w:t>
-      </w:r>
-      <w:proofErr w:type="spellStart"/>
-      <w:r>
-        <w:t>top_p</w:t>
-      </w:r>
-      <w:proofErr w:type="spellEnd"/>
-      <w:r>
-        <w:t xml:space="preserve">), the remaining part is discarded. Therefore, the lower the </w:t>
-      </w:r>
-      <w:proofErr w:type="spellStart"/>
-      <w:r>
-        <w:t>top_p</w:t>
-      </w:r>
-      <w:proofErr w:type="spellEnd"/>
-      <w:r>
-        <w:t xml:space="preserve">, the fewer choices LLMs have and thus more stable output. Table 1 shows the experimented </w:t>
-      </w:r>
-      <w:proofErr w:type="spellStart"/>
-      <w:r>
-        <w:t>top_p</w:t>
-      </w:r>
-      <w:proofErr w:type="spellEnd"/>
-      <w:r>
-        <w:t xml:space="preserve"> values and their respective </w:t>
-      </w:r>
-      <w:proofErr w:type="spellStart"/>
-      <w:r>
-        <w:t>pass@k</w:t>
-      </w:r>
-      <w:proofErr w:type="spellEnd"/>
+        <w:t>Then another hyperparameter, top_p, is experimented. It denotes the proportion of options that a LLM considers when responding. The LLM sorts the probabilities of the outputs in descending order and calculates the accumulated probability. Once the value exceeds the threshold (top_p), the remaining part is discarded. Therefore, the lower the top_p, the fewer choices LLMs have and thus more stable output. Table 1 shows the experimented top_p values and their respective pass@k</w:t>
+      </w:r>
       <w:r>
         <w:rPr>
           <w:rFonts w:hint="eastAsia"/>
@@ -1514,13 +1297,13 @@
               <w:spacing w:afterLines="0" w:after="0"/>
               <w:jc w:val="center"/>
               <w:rPr>
+                <w:rFonts w:hint="eastAsia"/>
                 <w:sz w:val="22"/>
                 <w:szCs w:val="21"/>
               </w:rPr>
             </w:pPr>
             <w:r>
               <w:rPr>
-                <w:rFonts w:hint="eastAsia"/>
                 <w:sz w:val="22"/>
                 <w:szCs w:val="21"/>
               </w:rPr>
@@ -1537,13 +1320,13 @@
               <w:spacing w:afterLines="0" w:after="0"/>
               <w:jc w:val="center"/>
               <w:rPr>
+                <w:rFonts w:hint="eastAsia"/>
                 <w:sz w:val="22"/>
                 <w:szCs w:val="21"/>
               </w:rPr>
             </w:pPr>
             <w:r>
               <w:rPr>
-                <w:rFonts w:hint="eastAsia"/>
                 <w:sz w:val="22"/>
                 <w:szCs w:val="21"/>
               </w:rPr>
@@ -1643,23 +1426,16 @@
         <w:spacing w:after="218"/>
       </w:pPr>
       <w:r>
-        <w:t xml:space="preserve">The accuracy metrics also have a rise and then fall when </w:t>
-      </w:r>
-      <w:proofErr w:type="spellStart"/>
-      <w:r>
-        <w:t>top_p</w:t>
-      </w:r>
-      <w:proofErr w:type="spellEnd"/>
-      <w:r>
-        <w:t xml:space="preserve"> decreases. Therefore, 0.8 is set as the value of </w:t>
-      </w:r>
-      <w:proofErr w:type="spellStart"/>
-      <w:r>
-        <w:t>top_p</w:t>
-      </w:r>
-      <w:proofErr w:type="spellEnd"/>
-      <w:r>
-        <w:t xml:space="preserve"> for subsequent implementations.</w:t>
+        <w:t xml:space="preserve">The accuracy metrics also have a rise and then fall when top_p decreases. </w:t>
+      </w:r>
+      <w:r>
+        <w:rPr>
+          <w:rFonts w:hint="eastAsia"/>
+        </w:rPr>
+        <w:t>Finally</w:t>
+      </w:r>
+      <w:r>
+        <w:t>, 0.8 is set as the value of top_p for subsequent implementations.</w:t>
       </w:r>
     </w:p>
     <w:p>
@@ -1685,29 +1461,12 @@
     <w:p>
       <w:pPr>
         <w:pStyle w:val="a7"/>
-        <w:rPr>
-          <w:rFonts w:hint="eastAsia"/>
-        </w:rPr>
-      </w:pPr>
-      <w:r>
-        <w:rPr>
-          <w:rFonts w:hint="eastAsia"/>
-        </w:rPr>
-        <w:t xml:space="preserve">Table 2: </w:t>
-      </w:r>
-      <w:proofErr w:type="spellStart"/>
-      <w:r>
-        <w:rPr>
-          <w:rFonts w:hint="eastAsia"/>
-        </w:rPr>
-        <w:t>Pass@k</w:t>
-      </w:r>
-      <w:proofErr w:type="spellEnd"/>
-      <w:r>
-        <w:rPr>
-          <w:rFonts w:hint="eastAsia"/>
-        </w:rPr>
-        <w:t xml:space="preserve"> of two methods with different evaluation methodology</w:t>
+      </w:pPr>
+      <w:r>
+        <w:rPr>
+          <w:rFonts w:hint="eastAsia"/>
+        </w:rPr>
+        <w:t>Table 2: Pass@k of two methods with different evaluation methodology</w:t>
       </w:r>
       <w:r>
         <w:rPr>
@@ -1742,9 +1501,6 @@
           <w:p>
             <w:pPr>
               <w:pStyle w:val="a7"/>
-              <w:rPr>
-                <w:rFonts w:hint="eastAsia"/>
-              </w:rPr>
             </w:pPr>
           </w:p>
         </w:tc>
@@ -1758,9 +1514,6 @@
           <w:p>
             <w:pPr>
               <w:pStyle w:val="a7"/>
-              <w:rPr>
-                <w:rFonts w:hint="eastAsia"/>
-              </w:rPr>
             </w:pPr>
             <w:r>
               <w:t>O</w:t>
@@ -1784,9 +1537,6 @@
           <w:p>
             <w:pPr>
               <w:pStyle w:val="a7"/>
-              <w:rPr>
-                <w:rFonts w:hint="eastAsia"/>
-              </w:rPr>
             </w:pPr>
           </w:p>
         </w:tc>
@@ -1841,9 +1591,6 @@
           <w:p>
             <w:pPr>
               <w:pStyle w:val="a7"/>
-              <w:rPr>
-                <w:rFonts w:hint="eastAsia"/>
-              </w:rPr>
             </w:pPr>
             <w:r>
               <w:rPr>
@@ -1911,9 +1658,6 @@
           <w:p>
             <w:pPr>
               <w:pStyle w:val="a7"/>
-              <w:rPr>
-                <w:rFonts w:hint="eastAsia"/>
-              </w:rPr>
             </w:pPr>
             <w:r>
               <w:rPr>
@@ -1970,9 +1714,6 @@
           <w:p>
             <w:pPr>
               <w:pStyle w:val="a7"/>
-              <w:rPr>
-                <w:rFonts w:hint="eastAsia"/>
-              </w:rPr>
             </w:pPr>
             <w:r>
               <w:rPr>
@@ -2010,7 +1751,6 @@
             <w:pPr>
               <w:pStyle w:val="a7"/>
               <w:rPr>
-                <w:rFonts w:hint="eastAsia"/>
                 <w:b/>
                 <w:bCs/>
               </w:rPr>
@@ -2036,9 +1776,6 @@
           <w:p>
             <w:pPr>
               <w:pStyle w:val="a7"/>
-              <w:rPr>
-                <w:rFonts w:hint="eastAsia"/>
-              </w:rPr>
             </w:pPr>
           </w:p>
         </w:tc>
@@ -2082,7 +1819,6 @@
             <w:pPr>
               <w:pStyle w:val="a7"/>
               <w:rPr>
-                <w:rFonts w:hint="eastAsia"/>
                 <w:b/>
                 <w:bCs/>
               </w:rPr>
@@ -2117,7 +1853,6 @@
             <w:pPr>
               <w:pStyle w:val="a7"/>
               <w:rPr>
-                <w:rFonts w:hint="eastAsia"/>
                 <w:b/>
                 <w:bCs/>
               </w:rPr>
@@ -2167,9 +1902,6 @@
           <w:p>
             <w:pPr>
               <w:pStyle w:val="a7"/>
-              <w:rPr>
-                <w:rFonts w:hint="eastAsia"/>
-              </w:rPr>
             </w:pPr>
             <w:r>
               <w:rPr>
@@ -2202,20 +1934,17 @@
           <w:p>
             <w:pPr>
               <w:pStyle w:val="a7"/>
-            </w:pPr>
-            <w:r>
-              <w:rPr>
-                <w:rFonts w:hint="eastAsia"/>
-              </w:rPr>
+              <w:rPr>
+                <w:rFonts w:hint="eastAsia"/>
+              </w:rPr>
+            </w:pPr>
+            <w:r>
               <w:t>0.654</w:t>
             </w:r>
           </w:p>
           <w:p>
             <w:pPr>
               <w:pStyle w:val="a7"/>
-              <w:rPr>
-                <w:rFonts w:hint="eastAsia"/>
-              </w:rPr>
             </w:pPr>
             <w:r>
               <w:rPr>
@@ -2238,9 +1967,6 @@
               <w:pStyle w:val="a7"/>
             </w:pPr>
             <w:r>
-              <w:rPr>
-                <w:rFonts w:hint="eastAsia"/>
-              </w:rPr>
               <w:t>0.746</w:t>
             </w:r>
           </w:p>
@@ -2248,7 +1974,6 @@
             <w:pPr>
               <w:pStyle w:val="a7"/>
               <w:rPr>
-                <w:rFonts w:hint="eastAsia"/>
                 <w:b/>
                 <w:bCs/>
               </w:rPr>
@@ -2295,16 +2020,8 @@
         <w:rPr>
           <w:rFonts w:hint="eastAsia"/>
         </w:rPr>
-        <w:t xml:space="preserve">4.3 </w:t>
-      </w:r>
-      <w:proofErr w:type="spellStart"/>
-      <w:r>
-        <w:rPr>
-          <w:rFonts w:hint="eastAsia"/>
-        </w:rPr>
-        <w:t>CodeT</w:t>
-      </w:r>
-      <w:proofErr w:type="spellEnd"/>
+        <w:t>4.3 CodeT</w:t>
+      </w:r>
     </w:p>
     <w:p>
       <w:pPr>
@@ -2314,21 +2031,7 @@
         <w:rPr>
           <w:rFonts w:hint="eastAsia"/>
         </w:rPr>
-        <w:t xml:space="preserve">The results of </w:t>
-      </w:r>
-      <w:proofErr w:type="spellStart"/>
-      <w:r>
-        <w:rPr>
-          <w:rFonts w:hint="eastAsia"/>
-        </w:rPr>
-        <w:t>codeT</w:t>
-      </w:r>
-      <w:proofErr w:type="spellEnd"/>
-      <w:r>
-        <w:rPr>
-          <w:rFonts w:hint="eastAsia"/>
-        </w:rPr>
-        <w:t xml:space="preserve"> compared with former methods are shown in Table 3.</w:t>
+        <w:t>The results of codeT compared with former methods are shown in Table 3.</w:t>
       </w:r>
     </w:p>
     <w:p>
@@ -2346,21 +2049,7 @@
         <w:rPr>
           <w:rFonts w:hint="eastAsia"/>
         </w:rPr>
-        <w:t xml:space="preserve">Performance of different methods. (5 to 3) denotes that </w:t>
-      </w:r>
-      <w:proofErr w:type="spellStart"/>
-      <w:r>
-        <w:rPr>
-          <w:rFonts w:hint="eastAsia"/>
-        </w:rPr>
-        <w:t>codeT</w:t>
-      </w:r>
-      <w:proofErr w:type="spellEnd"/>
-      <w:r>
-        <w:rPr>
-          <w:rFonts w:hint="eastAsia"/>
-        </w:rPr>
-        <w:t xml:space="preserve"> generates 5 solutions and pick the best 3 of them as final outputs. (t = 0.8, top p = 0.8)</w:t>
+        <w:t>Performance of different methods. (5 to 3) denotes that codeT generates 5 solutions and pick the best 3 of them as final outputs. (t = 0.8, top p = 0.8)</w:t>
       </w:r>
     </w:p>
     <w:tbl>
@@ -2385,9 +2074,6 @@
           <w:p>
             <w:pPr>
               <w:pStyle w:val="a7"/>
-              <w:rPr>
-                <w:rFonts w:hint="eastAsia"/>
-              </w:rPr>
             </w:pPr>
             <w:r>
               <w:rPr>
@@ -2404,9 +2090,6 @@
           <w:p>
             <w:pPr>
               <w:pStyle w:val="a7"/>
-              <w:rPr>
-                <w:rFonts w:hint="eastAsia"/>
-              </w:rPr>
             </w:pPr>
             <w:r>
               <w:rPr>
@@ -2423,9 +2106,6 @@
           <w:p>
             <w:pPr>
               <w:pStyle w:val="a7"/>
-              <w:rPr>
-                <w:rFonts w:hint="eastAsia"/>
-              </w:rPr>
             </w:pPr>
             <w:r>
               <w:rPr>
@@ -2444,9 +2124,6 @@
           <w:p>
             <w:pPr>
               <w:pStyle w:val="a7"/>
-              <w:rPr>
-                <w:rFonts w:hint="eastAsia"/>
-              </w:rPr>
             </w:pPr>
             <w:r>
               <w:t>B</w:t>
@@ -2471,9 +2148,6 @@
               </w:rPr>
             </w:pPr>
             <w:r>
-              <w:rPr>
-                <w:rFonts w:hint="eastAsia"/>
-              </w:rPr>
               <w:t>0.654</w:t>
             </w:r>
           </w:p>
@@ -2490,9 +2164,6 @@
               </w:rPr>
             </w:pPr>
             <w:r>
-              <w:rPr>
-                <w:rFonts w:hint="eastAsia"/>
-              </w:rPr>
               <w:t>0.746</w:t>
             </w:r>
           </w:p>
@@ -2506,9 +2177,6 @@
           <w:p>
             <w:pPr>
               <w:pStyle w:val="a7"/>
-              <w:rPr>
-                <w:rFonts w:hint="eastAsia"/>
-              </w:rPr>
             </w:pPr>
             <w:r>
               <w:rPr>
@@ -2525,9 +2193,6 @@
           <w:p>
             <w:pPr>
               <w:pStyle w:val="a7"/>
-              <w:rPr>
-                <w:rFonts w:hint="eastAsia"/>
-              </w:rPr>
             </w:pPr>
             <w:r>
               <w:rPr>
@@ -2544,9 +2209,6 @@
           <w:p>
             <w:pPr>
               <w:pStyle w:val="a7"/>
-              <w:rPr>
-                <w:rFonts w:hint="eastAsia"/>
-              </w:rPr>
             </w:pPr>
             <w:r>
               <w:rPr>
@@ -2565,23 +2227,12 @@
           <w:p>
             <w:pPr>
               <w:pStyle w:val="a7"/>
-              <w:rPr>
-                <w:rFonts w:hint="eastAsia"/>
-              </w:rPr>
-            </w:pPr>
-            <w:proofErr w:type="spellStart"/>
-            <w:r>
-              <w:rPr>
-                <w:rFonts w:hint="eastAsia"/>
-              </w:rPr>
-              <w:t>CodeT</w:t>
-            </w:r>
-            <w:proofErr w:type="spellEnd"/>
-            <w:r>
-              <w:rPr>
-                <w:rFonts w:hint="eastAsia"/>
-              </w:rPr>
-              <w:t xml:space="preserve"> (5 to 3)</w:t>
+            </w:pPr>
+            <w:r>
+              <w:rPr>
+                <w:rFonts w:hint="eastAsia"/>
+              </w:rPr>
+              <w:t>CodeT (5 to 3)</w:t>
             </w:r>
           </w:p>
         </w:tc>
@@ -2592,15 +2243,9 @@
           <w:p>
             <w:pPr>
               <w:pStyle w:val="a7"/>
-              <w:rPr>
-                <w:rFonts w:hint="eastAsia"/>
-              </w:rPr>
-            </w:pPr>
-            <w:r>
-              <w:rPr>
-                <w:rFonts w:hint="eastAsia"/>
-              </w:rPr>
-              <w:t>0.634</w:t>
+            </w:pPr>
+            <w:r>
+              <w:t>0.644</w:t>
             </w:r>
           </w:p>
         </w:tc>
@@ -2611,15 +2256,9 @@
           <w:p>
             <w:pPr>
               <w:pStyle w:val="a7"/>
-              <w:rPr>
-                <w:rFonts w:hint="eastAsia"/>
-              </w:rPr>
-            </w:pPr>
-            <w:r>
-              <w:rPr>
-                <w:rFonts w:hint="eastAsia"/>
-              </w:rPr>
-              <w:t>0.683</w:t>
+            </w:pPr>
+            <w:r>
+              <w:t>0.707</w:t>
             </w:r>
           </w:p>
         </w:tc>
@@ -2638,21 +2277,7 @@
         <w:rPr>
           <w:rFonts w:hint="eastAsia"/>
         </w:rPr>
-        <w:t xml:space="preserve">The result of </w:t>
-      </w:r>
-      <w:proofErr w:type="spellStart"/>
-      <w:r>
-        <w:rPr>
-          <w:rFonts w:hint="eastAsia"/>
-        </w:rPr>
-        <w:t>codeT</w:t>
-      </w:r>
-      <w:proofErr w:type="spellEnd"/>
-      <w:r>
-        <w:rPr>
-          <w:rFonts w:hint="eastAsia"/>
-        </w:rPr>
-        <w:t xml:space="preserve"> is worse than the baseline. A possible reason is that the method only generates few samples for each problem, which hinders its filtering ability.</w:t>
+        <w:t>The result of codeT is worse than the baseline. A possible reason is that the method only generates few samples for each problem, which hinders its filtering ability.</w:t>
       </w:r>
     </w:p>
     <w:p>
@@ -2688,9 +2313,6 @@
       <w:pPr>
         <w:pStyle w:val="a7"/>
         <w:jc w:val="both"/>
-        <w:rPr>
-          <w:rFonts w:hint="eastAsia"/>
-        </w:rPr>
       </w:pPr>
       <w:r>
         <w:rPr>
@@ -2739,9 +2361,6 @@
           <w:p>
             <w:pPr>
               <w:pStyle w:val="a7"/>
-              <w:rPr>
-                <w:rFonts w:hint="eastAsia"/>
-              </w:rPr>
             </w:pPr>
             <w:r>
               <w:rPr>
@@ -2758,9 +2377,6 @@
           <w:p>
             <w:pPr>
               <w:pStyle w:val="a7"/>
-              <w:rPr>
-                <w:rFonts w:hint="eastAsia"/>
-              </w:rPr>
             </w:pPr>
             <w:r>
               <w:rPr>
@@ -2777,9 +2393,6 @@
           <w:p>
             <w:pPr>
               <w:pStyle w:val="a7"/>
-              <w:rPr>
-                <w:rFonts w:hint="eastAsia"/>
-              </w:rPr>
             </w:pPr>
             <w:r>
               <w:rPr>
@@ -2798,9 +2411,6 @@
           <w:p>
             <w:pPr>
               <w:pStyle w:val="a7"/>
-              <w:rPr>
-                <w:rFonts w:hint="eastAsia"/>
-              </w:rPr>
             </w:pPr>
             <w:r>
               <w:t>B</w:t>
@@ -2825,9 +2435,6 @@
               </w:rPr>
             </w:pPr>
             <w:r>
-              <w:rPr>
-                <w:rFonts w:hint="eastAsia"/>
-              </w:rPr>
               <w:t>0.654</w:t>
             </w:r>
           </w:p>
@@ -2844,9 +2451,6 @@
               </w:rPr>
             </w:pPr>
             <w:r>
-              <w:rPr>
-                <w:rFonts w:hint="eastAsia"/>
-              </w:rPr>
               <w:t>0.746</w:t>
             </w:r>
           </w:p>
@@ -2860,9 +2464,6 @@
           <w:p>
             <w:pPr>
               <w:pStyle w:val="a7"/>
-              <w:rPr>
-                <w:rFonts w:hint="eastAsia"/>
-              </w:rPr>
             </w:pPr>
             <w:r>
               <w:t>C</w:t>
@@ -2882,9 +2483,6 @@
           <w:p>
             <w:pPr>
               <w:pStyle w:val="a7"/>
-              <w:rPr>
-                <w:rFonts w:hint="eastAsia"/>
-              </w:rPr>
             </w:pPr>
             <w:r>
               <w:rPr>
@@ -2920,9 +2518,6 @@
           <w:p>
             <w:pPr>
               <w:pStyle w:val="a7"/>
-              <w:rPr>
-                <w:rFonts w:hint="eastAsia"/>
-              </w:rPr>
             </w:pPr>
             <w:r>
               <w:rPr>
@@ -2934,27 +2529,14 @@
               <w:rPr>
                 <w:rFonts w:hint="eastAsia"/>
               </w:rPr>
-              <w:t xml:space="preserve"> </w:t>
-            </w:r>
-            <w:r>
-              <w:rPr>
-                <w:rFonts w:hint="eastAsia"/>
-              </w:rPr>
-              <w:t>(</w:t>
+              <w:t xml:space="preserve"> (</w:t>
             </w:r>
             <w:r>
               <w:rPr>
                 <w:rFonts w:hint="eastAsia"/>
                 <w:color w:val="FF0000"/>
               </w:rPr>
-              <w:t>+0.</w:t>
-            </w:r>
-            <w:r>
-              <w:rPr>
-                <w:rFonts w:hint="eastAsia"/>
-                <w:color w:val="FF0000"/>
-              </w:rPr>
-              <w:t>102</w:t>
+              <w:t>+0.102</w:t>
             </w:r>
             <w:r>
               <w:rPr>
@@ -2973,9 +2555,6 @@
           <w:p>
             <w:pPr>
               <w:pStyle w:val="a7"/>
-              <w:rPr>
-                <w:rFonts w:hint="eastAsia"/>
-              </w:rPr>
             </w:pPr>
             <w:r>
               <w:rPr>
@@ -2992,9 +2571,6 @@
           <w:p>
             <w:pPr>
               <w:pStyle w:val="a7"/>
-              <w:rPr>
-                <w:rFonts w:hint="eastAsia"/>
-              </w:rPr>
             </w:pPr>
             <w:r>
               <w:rPr>
@@ -3006,78 +2582,49 @@
               <w:rPr>
                 <w:rFonts w:hint="eastAsia"/>
               </w:rPr>
-              <w:t xml:space="preserve"> </w:t>
-            </w:r>
-            <w:r>
-              <w:rPr>
-                <w:rFonts w:hint="eastAsia"/>
-              </w:rPr>
-              <w:t>(</w:t>
+              <w:t xml:space="preserve"> (</w:t>
             </w:r>
             <w:r>
               <w:rPr>
                 <w:rFonts w:hint="eastAsia"/>
                 <w:color w:val="FF0000"/>
               </w:rPr>
-              <w:t>+0.</w:t>
+              <w:t>+0.111</w:t>
+            </w:r>
+            <w:r>
+              <w:rPr>
+                <w:rFonts w:hint="eastAsia"/>
+              </w:rPr>
+              <w:t>)</w:t>
+            </w:r>
+          </w:p>
+        </w:tc>
+        <w:tc>
+          <w:tcPr>
+            <w:tcW w:w="2766" w:type="dxa"/>
+          </w:tcPr>
+          <w:p>
+            <w:pPr>
+              <w:pStyle w:val="a7"/>
+            </w:pPr>
+            <w:r>
+              <w:rPr>
+                <w:rFonts w:hint="eastAsia"/>
+              </w:rPr>
+              <w:t>0.826</w:t>
+            </w:r>
+            <w:r>
+              <w:rPr>
+                <w:rFonts w:hint="eastAsia"/>
+              </w:rPr>
+              <w:t xml:space="preserve"> (</w:t>
             </w:r>
             <w:r>
               <w:rPr>
                 <w:rFonts w:hint="eastAsia"/>
                 <w:color w:val="FF0000"/>
               </w:rPr>
-              <w:t>111</w:t>
-            </w:r>
-            <w:r>
-              <w:rPr>
-                <w:rFonts w:hint="eastAsia"/>
-              </w:rPr>
-              <w:t>)</w:t>
-            </w:r>
-          </w:p>
-        </w:tc>
-        <w:tc>
-          <w:tcPr>
-            <w:tcW w:w="2766" w:type="dxa"/>
-          </w:tcPr>
-          <w:p>
-            <w:pPr>
-              <w:pStyle w:val="a7"/>
-              <w:rPr>
-                <w:rFonts w:hint="eastAsia"/>
-              </w:rPr>
-            </w:pPr>
-            <w:r>
-              <w:rPr>
-                <w:rFonts w:hint="eastAsia"/>
-              </w:rPr>
-              <w:t>0.826</w:t>
-            </w:r>
-            <w:r>
-              <w:rPr>
-                <w:rFonts w:hint="eastAsia"/>
-              </w:rPr>
-              <w:t xml:space="preserve"> </w:t>
-            </w:r>
-            <w:r>
-              <w:rPr>
-                <w:rFonts w:hint="eastAsia"/>
-              </w:rPr>
-              <w:t>(</w:t>
-            </w:r>
-            <w:r>
-              <w:rPr>
-                <w:rFonts w:hint="eastAsia"/>
-                <w:color w:val="FF0000"/>
-              </w:rPr>
-              <w:t>+0.0</w:t>
-            </w:r>
-            <w:r>
-              <w:rPr>
-                <w:rFonts w:hint="eastAsia"/>
-                <w:color w:val="FF0000"/>
-              </w:rPr>
-              <w:t>80</w:t>
+              <w:t>+0.080</w:t>
             </w:r>
             <w:r>
               <w:rPr>
@@ -3105,7 +2652,19 @@
         <w:rPr>
           <w:rFonts w:hint="eastAsia"/>
         </w:rPr>
-        <w:t xml:space="preserve">An increase of nearly 11% absolute accuracy is achieved comparing with the baseline, showing the </w:t>
+        <w:t>An increase of nearly 11% absolute accuracy is achieved compar</w:t>
+      </w:r>
+      <w:r>
+        <w:rPr>
+          <w:rFonts w:hint="eastAsia"/>
+        </w:rPr>
+        <w:t>ed</w:t>
+      </w:r>
+      <w:r>
+        <w:rPr>
+          <w:rFonts w:hint="eastAsia"/>
+        </w:rPr>
+        <w:t xml:space="preserve"> with the baseline, showing the </w:t>
       </w:r>
       <w:r>
         <w:rPr>
@@ -3120,21 +2679,946 @@
         <w:rPr>
           <w:rFonts w:hint="eastAsia"/>
         </w:rPr>
-        <w:t xml:space="preserve"> of the combined result. It confirms that the test set generated by </w:t>
-      </w:r>
-      <w:proofErr w:type="spellStart"/>
-      <w:r>
-        <w:rPr>
-          <w:rFonts w:hint="eastAsia"/>
-        </w:rPr>
-        <w:t>codeT</w:t>
-      </w:r>
-      <w:proofErr w:type="spellEnd"/>
-      <w:r>
-        <w:rPr>
-          <w:rFonts w:hint="eastAsia"/>
-        </w:rPr>
-        <w:t xml:space="preserve"> can reinforce the testing part of self-evolve and thus produce better feedbacks for self-refinement.</w:t>
+        <w:t xml:space="preserve"> of the combined result. It confirms that the test set generated by codeT can reinforce the testing part of self-evolve and thus produce better feedbacks for self-refinement.</w:t>
+      </w:r>
+      <w:r>
+        <w:rPr>
+          <w:rFonts w:hint="eastAsia"/>
+        </w:rPr>
+        <w:t xml:space="preserve"> The only problem which the combined method completely fail is problem 141 (</w:t>
+      </w:r>
+      <w:r>
+        <w:t>file</w:t>
+      </w:r>
+      <w:r>
+        <w:rPr>
+          <w:rFonts w:hint="eastAsia"/>
+        </w:rPr>
+        <w:t xml:space="preserve"> </w:t>
+      </w:r>
+      <w:r>
+        <w:t>name</w:t>
+      </w:r>
+      <w:r>
+        <w:rPr>
+          <w:rFonts w:hint="eastAsia"/>
+        </w:rPr>
+        <w:t xml:space="preserve"> </w:t>
+      </w:r>
+      <w:r>
+        <w:t>check</w:t>
+      </w:r>
+      <w:r>
+        <w:rPr>
+          <w:rFonts w:hint="eastAsia"/>
+        </w:rPr>
+        <w:t>)</w:t>
+      </w:r>
+      <w:r>
+        <w:rPr>
+          <w:rFonts w:hint="eastAsia"/>
+        </w:rPr>
+        <w:t>. T</w:t>
+      </w:r>
+      <w:r>
+        <w:rPr>
+          <w:rFonts w:hint="eastAsia"/>
+        </w:rPr>
+        <w:t xml:space="preserve">he main cause may be that the generated test set does not include </w:t>
+      </w:r>
+      <w:r>
+        <w:rPr>
+          <w:rFonts w:hint="eastAsia"/>
+        </w:rPr>
+        <w:t>border</w:t>
+      </w:r>
+      <w:r>
+        <w:rPr>
+          <w:rFonts w:hint="eastAsia"/>
+        </w:rPr>
+        <w:t xml:space="preserve"> cases</w:t>
+      </w:r>
+      <w:r>
+        <w:rPr>
+          <w:rFonts w:hint="eastAsia"/>
+        </w:rPr>
+        <w:t>, thus failing to detect and refine the code defect.</w:t>
+      </w:r>
+    </w:p>
+    <w:p>
+      <w:pPr>
+        <w:pStyle w:val="2"/>
+        <w:spacing w:after="156"/>
+      </w:pPr>
+      <w:r>
+        <w:rPr>
+          <w:rFonts w:hint="eastAsia"/>
+        </w:rPr>
+        <w:t xml:space="preserve">4.5 </w:t>
+      </w:r>
+      <w:r>
+        <w:rPr>
+          <w:rFonts w:hint="eastAsia"/>
+        </w:rPr>
+        <w:t>Inference</w:t>
+      </w:r>
+      <w:r>
+        <w:rPr>
+          <w:rFonts w:hint="eastAsia"/>
+        </w:rPr>
+        <w:t xml:space="preserve"> metrics</w:t>
+      </w:r>
+    </w:p>
+    <w:p>
+      <w:pPr>
+        <w:spacing w:after="218"/>
+        <w:rPr>
+          <w:rFonts w:hint="eastAsia"/>
+        </w:rPr>
+      </w:pPr>
+      <w:r>
+        <w:rPr>
+          <w:rFonts w:hint="eastAsia"/>
+        </w:rPr>
+        <w:t xml:space="preserve">Some inference metrics are recorded in Table 5 to measure the additional costs of </w:t>
+      </w:r>
+      <w:r>
+        <w:t>different</w:t>
+      </w:r>
+      <w:r>
+        <w:rPr>
+          <w:rFonts w:hint="eastAsia"/>
+        </w:rPr>
+        <w:t xml:space="preserve"> methods in contrast to the baseline. For the time cost, this report utilizes the time module of Python to calculate it</w:t>
+      </w:r>
+      <w:r>
+        <w:rPr>
+          <w:rFonts w:hint="eastAsia"/>
+        </w:rPr>
+        <w:t>, but sometimes the request process yields errors due to reasons like exceeding rate limit. This affects the accuracy of the data. F</w:t>
+      </w:r>
+      <w:r>
+        <w:rPr>
+          <w:rFonts w:hint="eastAsia"/>
+        </w:rPr>
+        <w:t xml:space="preserve">or the token usage, this report refers to </w:t>
+      </w:r>
+      <w:hyperlink r:id="rId9" w:history="1">
+        <w:r>
+          <w:rPr>
+            <w:rStyle w:val="a8"/>
+            <w:rFonts w:hint="eastAsia"/>
+          </w:rPr>
+          <w:t>Samb</w:t>
+        </w:r>
+        <w:r>
+          <w:rPr>
+            <w:rStyle w:val="a8"/>
+            <w:rFonts w:hint="eastAsia"/>
+          </w:rPr>
+          <w:t>a</w:t>
+        </w:r>
+        <w:r>
+          <w:rPr>
+            <w:rStyle w:val="a8"/>
+            <w:rFonts w:hint="eastAsia"/>
+          </w:rPr>
+          <w:t>No</w:t>
+        </w:r>
+        <w:r>
+          <w:rPr>
+            <w:rStyle w:val="a8"/>
+            <w:rFonts w:hint="eastAsia"/>
+          </w:rPr>
+          <w:t>v</w:t>
+        </w:r>
+        <w:r>
+          <w:rPr>
+            <w:rStyle w:val="a8"/>
+            <w:rFonts w:hint="eastAsia"/>
+          </w:rPr>
+          <w:t>a Cloud</w:t>
+        </w:r>
+      </w:hyperlink>
+      <w:r>
+        <w:rPr>
+          <w:rFonts w:hint="eastAsia"/>
+        </w:rPr>
+        <w:t xml:space="preserve"> where total input and output tokens </w:t>
+      </w:r>
+      <w:r>
+        <w:rPr>
+          <w:rFonts w:hint="eastAsia"/>
+        </w:rPr>
+        <w:lastRenderedPageBreak/>
+        <w:t>can be found.</w:t>
+      </w:r>
+      <w:r>
+        <w:rPr>
+          <w:rFonts w:hint="eastAsia"/>
+        </w:rPr>
+        <w:t xml:space="preserve"> However, sometimes the query may fail because of bad connections or </w:t>
+      </w:r>
+      <w:r>
+        <w:rPr>
+          <w:rFonts w:hint="eastAsia"/>
+        </w:rPr>
+        <w:t>e</w:t>
+      </w:r>
+      <w:r>
+        <w:t>xcessive requests</w:t>
+      </w:r>
+      <w:r>
+        <w:rPr>
+          <w:rFonts w:hint="eastAsia"/>
+        </w:rPr>
+        <w:t>, which may affect the accuracy of the statistics.</w:t>
+      </w:r>
+      <w:r>
+        <w:rPr>
+          <w:rFonts w:hint="eastAsia"/>
+        </w:rPr>
+        <w:t xml:space="preserve"> Therefore</w:t>
+      </w:r>
+      <w:r>
+        <w:rPr>
+          <w:rFonts w:hint="eastAsia"/>
+        </w:rPr>
+        <w:t xml:space="preserve">, </w:t>
+      </w:r>
+      <w:r>
+        <w:rPr>
+          <w:rFonts w:hint="eastAsia"/>
+        </w:rPr>
+        <w:t>the average of time and tokens consumed per problem</w:t>
+      </w:r>
+      <w:r>
+        <w:rPr>
+          <w:rFonts w:hint="eastAsia"/>
+        </w:rPr>
+        <w:t xml:space="preserve"> is </w:t>
+      </w:r>
+      <w:r>
+        <w:rPr>
+          <w:rFonts w:hint="eastAsia"/>
+        </w:rPr>
+        <w:t>calculated</w:t>
+      </w:r>
+      <w:r>
+        <w:rPr>
+          <w:rFonts w:hint="eastAsia"/>
+        </w:rPr>
+        <w:t xml:space="preserve"> to reduce the influence of the errors.</w:t>
+      </w:r>
+    </w:p>
+    <w:p>
+      <w:pPr>
+        <w:pStyle w:val="a7"/>
+        <w:jc w:val="both"/>
+        <w:rPr>
+          <w:rFonts w:hint="eastAsia"/>
+        </w:rPr>
+      </w:pPr>
+      <w:r>
+        <w:rPr>
+          <w:rFonts w:hint="eastAsia"/>
+        </w:rPr>
+        <w:t>Table 5: Inference cost</w:t>
+      </w:r>
+      <w:r>
+        <w:rPr>
+          <w:rFonts w:hint="eastAsia"/>
+        </w:rPr>
+        <w:t>s</w:t>
+      </w:r>
+      <w:r>
+        <w:rPr>
+          <w:rFonts w:hint="eastAsia"/>
+        </w:rPr>
+        <w:t xml:space="preserve"> of different methods</w:t>
+      </w:r>
+      <w:r>
+        <w:rPr>
+          <w:rFonts w:hint="eastAsia"/>
+        </w:rPr>
+        <w:t xml:space="preserve"> (T = total, A = average</w:t>
+      </w:r>
+      <w:r>
+        <w:rPr>
+          <w:rFonts w:hint="eastAsia"/>
+        </w:rPr>
+        <w:t>, Comb = Combined</w:t>
+      </w:r>
+      <w:r>
+        <w:rPr>
+          <w:rFonts w:hint="eastAsia"/>
+        </w:rPr>
+        <w:t>)</w:t>
+      </w:r>
+      <w:r>
+        <w:rPr>
+          <w:rFonts w:hint="eastAsia"/>
+        </w:rPr>
+        <w:t xml:space="preserve">. </w:t>
+      </w:r>
+      <w:r>
+        <w:rPr>
+          <w:rFonts w:hint="eastAsia"/>
+        </w:rPr>
+        <w:t xml:space="preserve">Time cost percentage for test is shown in the bracket. </w:t>
+      </w:r>
+      <w:r>
+        <w:rPr>
+          <w:rFonts w:hint="eastAsia"/>
+        </w:rPr>
+        <w:t>For CodeT and Combined methods, the time</w:t>
+      </w:r>
+      <w:r>
+        <w:rPr>
+          <w:rFonts w:hint="eastAsia"/>
+        </w:rPr>
+        <w:t xml:space="preserve"> cost for generating the test set is not included in their statistics.</w:t>
+      </w:r>
+    </w:p>
+    <w:tbl>
+      <w:tblPr>
+        <w:tblStyle w:val="21"/>
+        <w:tblW w:w="0" w:type="auto"/>
+        <w:tblLook w:val="0620" w:firstRow="1" w:lastRow="0" w:firstColumn="0" w:lastColumn="0" w:noHBand="1" w:noVBand="1"/>
+      </w:tblPr>
+      <w:tblGrid>
+        <w:gridCol w:w="1344"/>
+        <w:gridCol w:w="1097"/>
+        <w:gridCol w:w="1716"/>
+        <w:gridCol w:w="1098"/>
+        <w:gridCol w:w="1572"/>
+        <w:gridCol w:w="1472"/>
+      </w:tblGrid>
+      <w:tr>
+        <w:trPr>
+          <w:cnfStyle w:val="100000000000" w:firstRow="1" w:lastRow="0" w:firstColumn="0" w:lastColumn="0" w:oddVBand="0" w:evenVBand="0" w:oddHBand="0" w:evenHBand="0" w:firstRowFirstColumn="0" w:firstRowLastColumn="0" w:lastRowFirstColumn="0" w:lastRowLastColumn="0"/>
+        </w:trPr>
+        <w:tc>
+          <w:tcPr>
+            <w:tcW w:w="0" w:type="auto"/>
+          </w:tcPr>
+          <w:p>
+            <w:pPr>
+              <w:pStyle w:val="a7"/>
+              <w:rPr>
+                <w:rFonts w:hint="eastAsia"/>
+              </w:rPr>
+            </w:pPr>
+            <w:r>
+              <w:rPr>
+                <w:rFonts w:hint="eastAsia"/>
+              </w:rPr>
+              <w:t>Method</w:t>
+            </w:r>
+          </w:p>
+        </w:tc>
+        <w:tc>
+          <w:tcPr>
+            <w:tcW w:w="0" w:type="auto"/>
+          </w:tcPr>
+          <w:p>
+            <w:pPr>
+              <w:pStyle w:val="a7"/>
+              <w:rPr>
+                <w:rFonts w:hint="eastAsia"/>
+              </w:rPr>
+            </w:pPr>
+            <w:r>
+              <w:rPr>
+                <w:rFonts w:hint="eastAsia"/>
+              </w:rPr>
+              <w:t>T Outputs</w:t>
+            </w:r>
+          </w:p>
+        </w:tc>
+        <w:tc>
+          <w:tcPr>
+            <w:tcW w:w="0" w:type="auto"/>
+          </w:tcPr>
+          <w:p>
+            <w:pPr>
+              <w:pStyle w:val="a7"/>
+              <w:rPr>
+                <w:rFonts w:hint="eastAsia"/>
+              </w:rPr>
+            </w:pPr>
+            <w:r>
+              <w:rPr>
+                <w:rFonts w:hint="eastAsia"/>
+              </w:rPr>
+              <w:t>T Time</w:t>
+            </w:r>
+            <w:r>
+              <w:rPr>
+                <w:rFonts w:hint="eastAsia"/>
+              </w:rPr>
+              <w:t xml:space="preserve"> (s)</w:t>
+            </w:r>
+          </w:p>
+        </w:tc>
+        <w:tc>
+          <w:tcPr>
+            <w:tcW w:w="0" w:type="auto"/>
+          </w:tcPr>
+          <w:p>
+            <w:pPr>
+              <w:pStyle w:val="a7"/>
+              <w:rPr>
+                <w:rFonts w:hint="eastAsia"/>
+              </w:rPr>
+            </w:pPr>
+            <w:r>
+              <w:rPr>
+                <w:rFonts w:hint="eastAsia"/>
+              </w:rPr>
+              <w:t>A Time</w:t>
+            </w:r>
+            <w:r>
+              <w:rPr>
+                <w:rFonts w:hint="eastAsia"/>
+              </w:rPr>
+              <w:t xml:space="preserve"> (s)</w:t>
+            </w:r>
+          </w:p>
+        </w:tc>
+        <w:tc>
+          <w:tcPr>
+            <w:tcW w:w="0" w:type="auto"/>
+          </w:tcPr>
+          <w:p>
+            <w:pPr>
+              <w:pStyle w:val="a7"/>
+              <w:rPr>
+                <w:rFonts w:hint="eastAsia"/>
+              </w:rPr>
+            </w:pPr>
+            <w:r>
+              <w:rPr>
+                <w:rFonts w:hint="eastAsia"/>
+              </w:rPr>
+              <w:t>T I/O Tokens</w:t>
+            </w:r>
+          </w:p>
+        </w:tc>
+        <w:tc>
+          <w:tcPr>
+            <w:tcW w:w="0" w:type="auto"/>
+          </w:tcPr>
+          <w:p>
+            <w:pPr>
+              <w:pStyle w:val="a7"/>
+              <w:rPr>
+                <w:rFonts w:hint="eastAsia"/>
+              </w:rPr>
+            </w:pPr>
+            <w:r>
+              <w:rPr>
+                <w:rFonts w:hint="eastAsia"/>
+              </w:rPr>
+              <w:t>A I/O Tokens</w:t>
+            </w:r>
+          </w:p>
+        </w:tc>
+      </w:tr>
+      <w:tr>
+        <w:tc>
+          <w:tcPr>
+            <w:tcW w:w="0" w:type="auto"/>
+          </w:tcPr>
+          <w:p>
+            <w:pPr>
+              <w:pStyle w:val="a7"/>
+              <w:rPr>
+                <w:rFonts w:hint="eastAsia"/>
+              </w:rPr>
+            </w:pPr>
+            <w:r>
+              <w:rPr>
+                <w:rFonts w:hint="eastAsia"/>
+              </w:rPr>
+              <w:t>Baseline</w:t>
+            </w:r>
+          </w:p>
+        </w:tc>
+        <w:tc>
+          <w:tcPr>
+            <w:tcW w:w="0" w:type="auto"/>
+          </w:tcPr>
+          <w:p>
+            <w:pPr>
+              <w:pStyle w:val="a7"/>
+              <w:rPr>
+                <w:rFonts w:hint="eastAsia"/>
+              </w:rPr>
+            </w:pPr>
+            <w:r>
+              <w:rPr>
+                <w:rFonts w:hint="eastAsia"/>
+              </w:rPr>
+              <w:t>820</w:t>
+            </w:r>
+          </w:p>
+        </w:tc>
+        <w:tc>
+          <w:tcPr>
+            <w:tcW w:w="0" w:type="auto"/>
+          </w:tcPr>
+          <w:p>
+            <w:pPr>
+              <w:pStyle w:val="a7"/>
+              <w:rPr>
+                <w:rFonts w:hint="eastAsia"/>
+              </w:rPr>
+            </w:pPr>
+            <w:r>
+              <w:t>1773.804</w:t>
+            </w:r>
+          </w:p>
+        </w:tc>
+        <w:tc>
+          <w:tcPr>
+            <w:tcW w:w="0" w:type="auto"/>
+          </w:tcPr>
+          <w:p>
+            <w:pPr>
+              <w:pStyle w:val="a7"/>
+              <w:rPr>
+                <w:rFonts w:hint="eastAsia"/>
+              </w:rPr>
+            </w:pPr>
+            <w:r>
+              <w:rPr>
+                <w:rFonts w:hint="eastAsia"/>
+              </w:rPr>
+              <w:t>2.163</w:t>
+            </w:r>
+          </w:p>
+        </w:tc>
+        <w:tc>
+          <w:tcPr>
+            <w:tcW w:w="0" w:type="auto"/>
+          </w:tcPr>
+          <w:p>
+            <w:pPr>
+              <w:pStyle w:val="a7"/>
+              <w:rPr>
+                <w:rFonts w:hint="eastAsia"/>
+              </w:rPr>
+            </w:pPr>
+            <w:r>
+              <w:rPr>
+                <w:rFonts w:hint="eastAsia"/>
+              </w:rPr>
+              <w:t>146310/155465</w:t>
+            </w:r>
+          </w:p>
+        </w:tc>
+        <w:tc>
+          <w:tcPr>
+            <w:tcW w:w="0" w:type="auto"/>
+          </w:tcPr>
+          <w:p>
+            <w:pPr>
+              <w:pStyle w:val="a7"/>
+              <w:rPr>
+                <w:rFonts w:hint="eastAsia"/>
+              </w:rPr>
+            </w:pPr>
+            <w:r>
+              <w:rPr>
+                <w:rFonts w:hint="eastAsia"/>
+              </w:rPr>
+              <w:t>178.43/189.59</w:t>
+            </w:r>
+          </w:p>
+        </w:tc>
+      </w:tr>
+      <w:tr>
+        <w:tc>
+          <w:tcPr>
+            <w:tcW w:w="0" w:type="auto"/>
+          </w:tcPr>
+          <w:p>
+            <w:pPr>
+              <w:pStyle w:val="a7"/>
+              <w:rPr>
+                <w:rFonts w:hint="eastAsia"/>
+              </w:rPr>
+            </w:pPr>
+            <w:r>
+              <w:rPr>
+                <w:rFonts w:hint="eastAsia"/>
+              </w:rPr>
+              <w:t>Self-evolve</w:t>
+            </w:r>
+          </w:p>
+        </w:tc>
+        <w:tc>
+          <w:tcPr>
+            <w:tcW w:w="0" w:type="auto"/>
+          </w:tcPr>
+          <w:p>
+            <w:pPr>
+              <w:pStyle w:val="a7"/>
+              <w:rPr>
+                <w:rFonts w:hint="eastAsia"/>
+              </w:rPr>
+            </w:pPr>
+            <w:r>
+              <w:rPr>
+                <w:rFonts w:hint="eastAsia"/>
+              </w:rPr>
+              <w:t>820</w:t>
+            </w:r>
+          </w:p>
+        </w:tc>
+        <w:tc>
+          <w:tcPr>
+            <w:tcW w:w="0" w:type="auto"/>
+          </w:tcPr>
+          <w:p>
+            <w:pPr>
+              <w:pStyle w:val="a7"/>
+              <w:rPr>
+                <w:rFonts w:hint="eastAsia"/>
+              </w:rPr>
+            </w:pPr>
+            <w:r>
+              <w:t>4634.387</w:t>
+            </w:r>
+            <w:r>
+              <w:rPr>
+                <w:rFonts w:hint="eastAsia"/>
+              </w:rPr>
+              <w:t xml:space="preserve"> (6.41%)</w:t>
+            </w:r>
+          </w:p>
+        </w:tc>
+        <w:tc>
+          <w:tcPr>
+            <w:tcW w:w="0" w:type="auto"/>
+          </w:tcPr>
+          <w:p>
+            <w:pPr>
+              <w:pStyle w:val="a7"/>
+              <w:rPr>
+                <w:rFonts w:hint="eastAsia"/>
+              </w:rPr>
+            </w:pPr>
+            <w:r>
+              <w:rPr>
+                <w:rFonts w:hint="eastAsia"/>
+              </w:rPr>
+              <w:t>5.652</w:t>
+            </w:r>
+          </w:p>
+        </w:tc>
+        <w:tc>
+          <w:tcPr>
+            <w:tcW w:w="0" w:type="auto"/>
+          </w:tcPr>
+          <w:p>
+            <w:pPr>
+              <w:pStyle w:val="a7"/>
+              <w:rPr>
+                <w:rFonts w:hint="eastAsia"/>
+              </w:rPr>
+            </w:pPr>
+            <w:r>
+              <w:rPr>
+                <w:rFonts w:hint="eastAsia"/>
+              </w:rPr>
+              <w:t>722973/368655</w:t>
+            </w:r>
+          </w:p>
+        </w:tc>
+        <w:tc>
+          <w:tcPr>
+            <w:tcW w:w="0" w:type="auto"/>
+          </w:tcPr>
+          <w:p>
+            <w:pPr>
+              <w:pStyle w:val="a7"/>
+              <w:rPr>
+                <w:rFonts w:hint="eastAsia"/>
+              </w:rPr>
+            </w:pPr>
+            <w:r>
+              <w:rPr>
+                <w:rFonts w:hint="eastAsia"/>
+              </w:rPr>
+              <w:t>881.67/449.58</w:t>
+            </w:r>
+          </w:p>
+        </w:tc>
+      </w:tr>
+      <w:tr>
+        <w:tc>
+          <w:tcPr>
+            <w:tcW w:w="0" w:type="auto"/>
+          </w:tcPr>
+          <w:p>
+            <w:pPr>
+              <w:pStyle w:val="a7"/>
+              <w:rPr>
+                <w:rFonts w:hint="eastAsia"/>
+              </w:rPr>
+            </w:pPr>
+            <w:r>
+              <w:rPr>
+                <w:rFonts w:hint="eastAsia"/>
+              </w:rPr>
+              <w:t>CodeT (5to3)</w:t>
+            </w:r>
+          </w:p>
+        </w:tc>
+        <w:tc>
+          <w:tcPr>
+            <w:tcW w:w="0" w:type="auto"/>
+          </w:tcPr>
+          <w:p>
+            <w:pPr>
+              <w:pStyle w:val="a7"/>
+              <w:rPr>
+                <w:rFonts w:hint="eastAsia"/>
+              </w:rPr>
+            </w:pPr>
+            <w:r>
+              <w:rPr>
+                <w:rFonts w:hint="eastAsia"/>
+              </w:rPr>
+              <w:t>492</w:t>
+            </w:r>
+          </w:p>
+        </w:tc>
+        <w:tc>
+          <w:tcPr>
+            <w:tcW w:w="0" w:type="auto"/>
+          </w:tcPr>
+          <w:p>
+            <w:pPr>
+              <w:pStyle w:val="a7"/>
+              <w:rPr>
+                <w:rFonts w:hint="eastAsia"/>
+              </w:rPr>
+            </w:pPr>
+            <w:r>
+              <w:rPr>
+                <w:rFonts w:hint="eastAsia"/>
+              </w:rPr>
+              <w:t>4328.430 (56.7%)</w:t>
+            </w:r>
+          </w:p>
+        </w:tc>
+        <w:tc>
+          <w:tcPr>
+            <w:tcW w:w="0" w:type="auto"/>
+          </w:tcPr>
+          <w:p>
+            <w:pPr>
+              <w:pStyle w:val="a7"/>
+              <w:rPr>
+                <w:rFonts w:hint="eastAsia"/>
+              </w:rPr>
+            </w:pPr>
+            <w:r>
+              <w:rPr>
+                <w:rFonts w:hint="eastAsia"/>
+              </w:rPr>
+              <w:t>8.798</w:t>
+            </w:r>
+          </w:p>
+        </w:tc>
+        <w:tc>
+          <w:tcPr>
+            <w:tcW w:w="0" w:type="auto"/>
+          </w:tcPr>
+          <w:p>
+            <w:pPr>
+              <w:pStyle w:val="a7"/>
+              <w:rPr>
+                <w:rFonts w:hint="eastAsia"/>
+              </w:rPr>
+            </w:pPr>
+            <w:r>
+              <w:rPr>
+                <w:rFonts w:hint="eastAsia"/>
+              </w:rPr>
+              <w:t>186490/48297</w:t>
+            </w:r>
+          </w:p>
+        </w:tc>
+        <w:tc>
+          <w:tcPr>
+            <w:tcW w:w="0" w:type="auto"/>
+          </w:tcPr>
+          <w:p>
+            <w:pPr>
+              <w:pStyle w:val="a7"/>
+              <w:rPr>
+                <w:rFonts w:hint="eastAsia"/>
+              </w:rPr>
+            </w:pPr>
+            <w:r>
+              <w:rPr>
+                <w:rFonts w:hint="eastAsia"/>
+              </w:rPr>
+              <w:t>379.04/98.16</w:t>
+            </w:r>
+          </w:p>
+        </w:tc>
+      </w:tr>
+      <w:tr>
+        <w:tc>
+          <w:tcPr>
+            <w:tcW w:w="0" w:type="auto"/>
+          </w:tcPr>
+          <w:p>
+            <w:pPr>
+              <w:pStyle w:val="a7"/>
+              <w:rPr>
+                <w:rFonts w:hint="eastAsia"/>
+              </w:rPr>
+            </w:pPr>
+            <w:r>
+              <w:rPr>
+                <w:rFonts w:hint="eastAsia"/>
+              </w:rPr>
+              <w:t>Comb (10to5)</w:t>
+            </w:r>
+          </w:p>
+        </w:tc>
+        <w:tc>
+          <w:tcPr>
+            <w:tcW w:w="0" w:type="auto"/>
+          </w:tcPr>
+          <w:p>
+            <w:pPr>
+              <w:pStyle w:val="a7"/>
+              <w:rPr>
+                <w:rFonts w:hint="eastAsia"/>
+              </w:rPr>
+            </w:pPr>
+            <w:r>
+              <w:rPr>
+                <w:rFonts w:hint="eastAsia"/>
+              </w:rPr>
+              <w:t>820</w:t>
+            </w:r>
+          </w:p>
+        </w:tc>
+        <w:tc>
+          <w:tcPr>
+            <w:tcW w:w="0" w:type="auto"/>
+          </w:tcPr>
+          <w:p>
+            <w:pPr>
+              <w:pStyle w:val="a7"/>
+              <w:rPr>
+                <w:rFonts w:hint="eastAsia"/>
+              </w:rPr>
+            </w:pPr>
+            <w:r>
+              <w:t>12852.132</w:t>
+            </w:r>
+            <w:r>
+              <w:rPr>
+                <w:rFonts w:hint="eastAsia"/>
+              </w:rPr>
+              <w:t>(38.3%)</w:t>
+            </w:r>
+          </w:p>
+        </w:tc>
+        <w:tc>
+          <w:tcPr>
+            <w:tcW w:w="0" w:type="auto"/>
+          </w:tcPr>
+          <w:p>
+            <w:pPr>
+              <w:pStyle w:val="a7"/>
+              <w:rPr>
+                <w:rFonts w:hint="eastAsia"/>
+              </w:rPr>
+            </w:pPr>
+            <w:r>
+              <w:rPr>
+                <w:rFonts w:hint="eastAsia"/>
+              </w:rPr>
+              <w:t>15.673</w:t>
+            </w:r>
+          </w:p>
+        </w:tc>
+        <w:tc>
+          <w:tcPr>
+            <w:tcW w:w="0" w:type="auto"/>
+          </w:tcPr>
+          <w:p>
+            <w:pPr>
+              <w:pStyle w:val="a7"/>
+              <w:rPr>
+                <w:rFonts w:hint="eastAsia"/>
+              </w:rPr>
+            </w:pPr>
+            <w:r>
+              <w:rPr>
+                <w:rFonts w:hint="eastAsia"/>
+              </w:rPr>
+              <w:t>1378892/640665</w:t>
+            </w:r>
+          </w:p>
+        </w:tc>
+        <w:tc>
+          <w:tcPr>
+            <w:tcW w:w="0" w:type="auto"/>
+          </w:tcPr>
+          <w:p>
+            <w:pPr>
+              <w:pStyle w:val="a7"/>
+              <w:rPr>
+                <w:rFonts w:hint="eastAsia"/>
+              </w:rPr>
+            </w:pPr>
+            <w:r>
+              <w:rPr>
+                <w:rFonts w:hint="eastAsia"/>
+              </w:rPr>
+              <w:t>1681.58/781.30</w:t>
+            </w:r>
+          </w:p>
+        </w:tc>
+      </w:tr>
+    </w:tbl>
+    <w:p>
+      <w:pPr>
+        <w:pStyle w:val="a7"/>
+      </w:pPr>
+    </w:p>
+    <w:p>
+      <w:pPr>
+        <w:spacing w:after="218"/>
+        <w:rPr>
+          <w:rFonts w:hint="eastAsia"/>
+        </w:rPr>
+      </w:pPr>
+      <w:r>
+        <w:rPr>
+          <w:rFonts w:hint="eastAsia"/>
+        </w:rPr>
+        <w:t xml:space="preserve">Although the combined method achieves great </w:t>
+      </w:r>
+      <w:r>
+        <w:t>improvement</w:t>
+      </w:r>
+      <w:r>
+        <w:rPr>
+          <w:rFonts w:hint="eastAsia"/>
+        </w:rPr>
+        <w:t xml:space="preserve"> in the accuracy, it costs more than 7 times of time and 9 times of input tokens.</w:t>
       </w:r>
     </w:p>
     <w:p>
@@ -3160,24 +3644,18 @@
     <w:p>
       <w:pPr>
         <w:spacing w:after="218"/>
-        <w:rPr>
-          <w:rFonts w:hint="eastAsia"/>
-        </w:rPr>
-      </w:pPr>
-      <w:r>
-        <w:t xml:space="preserve">Currently, the test set of </w:t>
-      </w:r>
-      <w:proofErr w:type="spellStart"/>
-      <w:r>
-        <w:t>codeT</w:t>
-      </w:r>
-      <w:proofErr w:type="spellEnd"/>
-      <w:r>
-        <w:t xml:space="preserve"> is manually cleaned to improve its quality. When </w:t>
-      </w:r>
-      <w:r>
-        <w:lastRenderedPageBreak/>
-        <w:t>implementing this method to other datasets, using generated test set without manual modification may reduce its improvement, which needs to be further evaluated. Moreover, the developed method keeps the hyperparameters the same when requesting the LLM. More improvement may be achieved if the hyperparameters in each requesting step is modified respectively. There is still significant room for improvement in future work.</w:t>
+      </w:pPr>
+      <w:r>
+        <w:t xml:space="preserve">Currently, the test set of codeT is manually </w:t>
+      </w:r>
+      <w:r>
+        <w:rPr>
+          <w:rFonts w:hint="eastAsia"/>
+        </w:rPr>
+        <w:t>modified</w:t>
+      </w:r>
+      <w:r>
+        <w:t xml:space="preserve"> to improve its quality. When implementing this method to other datasets, using generated test set without manual modification may reduce its improvement, which needs to be further evaluated. Moreover, the developed method keeps the hyperparameters the same when requesting the LLM. More improvement may be achieved if the hyperparameters in each requesting step is modified respectively. There is still significant room for improvement in future work.</w:t>
       </w:r>
     </w:p>
     <w:p>
@@ -3191,11 +3669,17 @@
         </w:rPr>
         <w:t>Reference</w:t>
       </w:r>
+      <w:r>
+        <w:rPr>
+          <w:rFonts w:hint="eastAsia"/>
+        </w:rPr>
+        <w:t>s</w:t>
+      </w:r>
     </w:p>
     <w:p>
       <w:pPr>
         <w:pStyle w:val="EndNoteBibliography"/>
-        <w:spacing w:after="218"/>
+        <w:spacing w:afterLines="0" w:after="0"/>
         <w:ind w:left="720" w:hanging="720"/>
       </w:pPr>
       <w:r>
@@ -3227,7 +3711,7 @@
     <w:p>
       <w:pPr>
         <w:pStyle w:val="EndNoteBibliography"/>
-        <w:spacing w:after="218"/>
+        <w:spacing w:afterLines="0" w:after="0"/>
         <w:ind w:left="720" w:hanging="720"/>
       </w:pPr>
       <w:r>
@@ -3240,19 +3724,19 @@
     </w:p>
     <w:p>
       <w:pPr>
-        <w:spacing w:after="218"/>
+        <w:spacing w:afterLines="0" w:after="0"/>
       </w:pPr>
       <w:r>
         <w:fldChar w:fldCharType="end"/>
       </w:r>
     </w:p>
     <w:sectPr>
-      <w:headerReference w:type="even" r:id="rId9"/>
-      <w:headerReference w:type="default" r:id="rId10"/>
-      <w:footerReference w:type="even" r:id="rId11"/>
-      <w:footerReference w:type="default" r:id="rId12"/>
-      <w:headerReference w:type="first" r:id="rId13"/>
-      <w:footerReference w:type="first" r:id="rId14"/>
+      <w:headerReference w:type="even" r:id="rId10"/>
+      <w:headerReference w:type="default" r:id="rId11"/>
+      <w:footerReference w:type="even" r:id="rId12"/>
+      <w:footerReference w:type="default" r:id="rId13"/>
+      <w:headerReference w:type="first" r:id="rId14"/>
+      <w:footerReference w:type="first" r:id="rId15"/>
       <w:pgSz w:w="11906" w:h="16838"/>
       <w:pgMar w:top="1440" w:right="1800" w:bottom="1440" w:left="1800" w:header="851" w:footer="992" w:gutter="0"/>
       <w:cols w:space="425"/>
@@ -4340,6 +4824,96 @@
       <w:color w:val="96607D" w:themeColor="followedHyperlink"/>
       <w:u w:val="single"/>
     </w:rPr>
+  </w:style>
+  <w:style w:type="table" w:styleId="3">
+    <w:name w:val="Plain Table 3"/>
+    <w:basedOn w:val="a1"/>
+    <w:uiPriority w:val="43"/>
+    <w:rsid w:val="00B54CC4"/>
+    <w:tblPr>
+      <w:tblStyleRowBandSize w:val="1"/>
+      <w:tblStyleColBandSize w:val="1"/>
+    </w:tblPr>
+    <w:tblStylePr w:type="firstRow">
+      <w:rPr>
+        <w:b/>
+        <w:bCs/>
+        <w:caps/>
+      </w:rPr>
+      <w:tblPr/>
+      <w:tcPr>
+        <w:tcBorders>
+          <w:bottom w:val="single" w:sz="4" w:space="0" w:color="7F7F7F" w:themeColor="text1" w:themeTint="80"/>
+        </w:tcBorders>
+      </w:tcPr>
+    </w:tblStylePr>
+    <w:tblStylePr w:type="lastRow">
+      <w:rPr>
+        <w:b/>
+        <w:bCs/>
+        <w:caps/>
+      </w:rPr>
+      <w:tblPr/>
+      <w:tcPr>
+        <w:tcBorders>
+          <w:top w:val="nil"/>
+        </w:tcBorders>
+      </w:tcPr>
+    </w:tblStylePr>
+    <w:tblStylePr w:type="firstCol">
+      <w:rPr>
+        <w:b/>
+        <w:bCs/>
+        <w:caps/>
+      </w:rPr>
+      <w:tblPr/>
+      <w:tcPr>
+        <w:tcBorders>
+          <w:right w:val="single" w:sz="4" w:space="0" w:color="7F7F7F" w:themeColor="text1" w:themeTint="80"/>
+        </w:tcBorders>
+      </w:tcPr>
+    </w:tblStylePr>
+    <w:tblStylePr w:type="lastCol">
+      <w:rPr>
+        <w:b/>
+        <w:bCs/>
+        <w:caps/>
+      </w:rPr>
+      <w:tblPr/>
+      <w:tcPr>
+        <w:tcBorders>
+          <w:left w:val="nil"/>
+        </w:tcBorders>
+      </w:tcPr>
+    </w:tblStylePr>
+    <w:tblStylePr w:type="band1Vert">
+      <w:tblPr/>
+      <w:tcPr>
+        <w:shd w:val="clear" w:color="auto" w:fill="F2F2F2" w:themeFill="background1" w:themeFillShade="F2"/>
+      </w:tcPr>
+    </w:tblStylePr>
+    <w:tblStylePr w:type="band1Horz">
+      <w:tblPr/>
+      <w:tcPr>
+        <w:shd w:val="clear" w:color="auto" w:fill="F2F2F2" w:themeFill="background1" w:themeFillShade="F2"/>
+      </w:tcPr>
+    </w:tblStylePr>
+    <w:tblStylePr w:type="neCell">
+      <w:tblPr/>
+      <w:tcPr>
+        <w:tcBorders>
+          <w:left w:val="nil"/>
+        </w:tcBorders>
+      </w:tcPr>
+    </w:tblStylePr>
+    <w:tblStylePr w:type="nwCell">
+      <w:tblPr/>
+      <w:tcPr>
+        <w:tcBorders>
+          <w:right w:val="nil"/>
+        </w:tcBorders>
+      </w:tcPr>
+    </w:tblStylePr>
   </w:style>
 </w:styles>
 </file>

</xml_diff>